<commit_message>
Tugas 1: logo Amikom, header laporan, lini waktu dua panel, slide 5 menit
- Lini waktu dipecah dua panel (2009–2015 dan Jan–Apr 2016 diperbesar);
  jarak antargelombang digambar sebagai rentang; Gartner dan briefing
  wamen dipisah
- Mata uang dikoreksi US$ -> C$ (dolar Kanada) di diagram, laporan, slide
- Versi slide kedua diagram: huruf besar, label dwibahasa
- Laporan final: logo di sampul, header berlogo di halaman isi
- Slide dipadatkan menjadi 7 slide untuk 5 menit + 2 cadangan, dengan logo

Co-Authored-By: Claude Opus 5.5 <noreply@anthropic.com>
</commit_message>
<xml_diff>
--- a/tugas1/hasil/Tugas1_DistribusiEffort_Phoenix_Laporan.docx
+++ b/tugas1/hasil/Tugas1_DistribusiEffort_Phoenix_Laporan.docx
@@ -482,7 +482,7 @@
         <w:jc w:val="both"/>
       </w:pPr>
       <w:r>
-        <w:t xml:space="preserve">Pada 2009, Pemerintah Kanada memulai penggantian sistem gaji berusia 40 tahun untuk sekitar 290.000 pegawai di 101 instansi, dengan target penghematan sekitar US$70 juta per tahun. Kementerian Public Services and Procurement Canada (PSPC) memimpin proyek dan pada 2011 mengontrak IBM untuk mengkustomisasi (mengubah agar sesuai kebutuhan) </w:t>
+        <w:t xml:space="preserve">Pada 2009, Pemerintah Kanada memulai penggantian sistem gaji berusia 40 tahun untuk sekitar 290.000 pegawai di 101 instansi, dengan target penghematan sekitar C$70 juta per tahun (C$ = dolar Kanada). Kementerian Public Services and Procurement Canada (PSPC) memimpin proyek dan pada 2011 mengontrak IBM untuk mengkustomisasi (mengubah agar sesuai kebutuhan) </w:t>
       </w:r>
       <w:r>
         <w:rPr>
@@ -511,7 +511,7 @@
       <w:r>
         <w:drawing>
           <wp:inline xmlns:a="http://schemas.openxmlformats.org/drawingml/2006/main" xmlns:pic="http://schemas.openxmlformats.org/drawingml/2006/picture">
-            <wp:extent cx="5760000" cy="3037091"/>
+            <wp:extent cx="5760000" cy="2905043"/>
             <wp:docPr id="1" name="Picture 1"/>
             <wp:cNvGraphicFramePr>
               <a:graphicFrameLocks noChangeAspect="1"/>
@@ -532,7 +532,7 @@
                   <pic:spPr>
                     <a:xfrm>
                       <a:off x="0" y="0"/>
-                      <a:ext cx="5760000" cy="3037091"/>
+                      <a:ext cx="5760000" cy="2905043"/>
                     </a:xfrm>
                     <a:prstGeom prst="rect"/>
                   </pic:spPr>
@@ -561,7 +561,7 @@
         <w:jc w:val="both"/>
       </w:pPr>
       <w:r>
-        <w:t>Hasilnya buruk. Pada Juni 2017, nilai gaji yang salah atau tertunda melebihi US$520 juta, sekitar 51% pegawai menerima slip gaji yang salah, dan lebih dari 494.500 permintaan perbaikan menumpuk. OAG menyebut proyek ini sebagai kegagalan manajemen proyek dan pengawasan yang “</w:t>
+        <w:t>Hasilnya buruk. Pada Juni 2017, nilai gaji yang salah atau tertunda melebihi C$520 juta, sekitar 51% pegawai menerima slip gaji yang salah, dan lebih dari 494.500 permintaan perbaikan menumpuk. OAG menyebut proyek ini sebagai kegagalan manajemen proyek dan pengawasan yang “</w:t>
       </w:r>
       <w:r>
         <w:rPr>
@@ -589,7 +589,7 @@
         <w:jc w:val="both"/>
       </w:pPr>
       <w:r>
-        <w:t>Ketika perkiraan biaya IBM (US$274 juta) hampir dua kali anggaran (US$155 juta), lebih dari 100 fungsi gaji dihapus atau ditunda, pengujian dikurangi, jarak antargelombang dipadatkan dari 7 menjadi 2 bulan, dan staf dikurangi, tanpa perencanaan ulang.</w:t>
+        <w:t>Ketika perkiraan biaya IBM (C$274 juta) hampir dua kali anggaran (C$155 juta), lebih dari 100 fungsi gaji dihapus atau ditunda, pengujian dikurangi, jarak antargelombang dipadatkan dari 7 menjadi 2 bulan, dan staf dikurangi, tanpa perencanaan ulang.</w:t>
       </w:r>
     </w:p>
     <w:p>
@@ -1431,7 +1431,7 @@
         <w:t>triple constraint</w:t>
       </w:r>
       <w:r>
-        <w:t xml:space="preserve"> (tiga kendala proyek: lingkup, waktu, biaya), waktu dan biaya dikunci, sehingga lingkup dan mutu yang dikorbankan. Padahal mutu dijaga oleh pengujian, uji coba, dan pengawasan. Karena biaya perbaikan kesalahan paling mahal setelah sistem dipakai, penghematan di tahap ini dibayar mahal: lebih dari US$520 juta gaji salah atau tertunda dalam setahun.</w:t>
+        <w:t xml:space="preserve"> (tiga kendala proyek: lingkup, waktu, biaya), waktu dan biaya dikunci, sehingga lingkup dan mutu yang dikorbankan. Padahal mutu dijaga oleh pengujian, uji coba, dan pengawasan. Karena biaya perbaikan kesalahan paling mahal setelah sistem dipakai, penghematan di tahap ini dibayar mahal: lebih dari C$520 juta gaji salah atau tertunda dalam setahun.</w:t>
       </w:r>
     </w:p>
     <w:p>

</xml_diff>

<commit_message>
Tugas 1: isi nama dan NIM di sampul laporan dan slide judul
Co-Authored-By: Claude Opus 5.5 <noreply@anthropic.com>
</commit_message>
<xml_diff>
--- a/tugas1/hasil/Tugas1_DistribusiEffort_Phoenix_Laporan.docx
+++ b/tugas1/hasil/Tugas1_DistribusiEffort_Phoenix_Laporan.docx
@@ -40,13 +40,7 @@
         <w:jc w:val="center"/>
       </w:pPr>
       <w:r>
-        <w:t xml:space="preserve">Nama: </w:t>
-      </w:r>
-      <w:r>
-        <w:rPr>
-          <w:highlight w:val="yellow"/>
-        </w:rPr>
-        <w:t>[isi nama]</w:t>
+        <w:t>Nama: EKA PUTRA KURNIA</w:t>
       </w:r>
     </w:p>
     <w:p>
@@ -54,13 +48,7 @@
         <w:jc w:val="center"/>
       </w:pPr>
       <w:r>
-        <w:t xml:space="preserve">NIM: </w:t>
-      </w:r>
-      <w:r>
-        <w:rPr>
-          <w:highlight w:val="yellow"/>
-        </w:rPr>
-        <w:t>[isi NIM]</w:t>
+        <w:t>NIM: 25.55.2927</w:t>
       </w:r>
     </w:p>
     <w:p>

</xml_diff>